<commit_message>
Update to final version
</commit_message>
<xml_diff>
--- a/report.docx
+++ b/report.docx
@@ -6467,30 +6467,1671 @@
     <w:p>
       <w:pPr>
         <w:rPr>
-          <w:rFonts w:hint="eastAsia"/>
+          <w:b/>
+          <w:bCs/>
         </w:rPr>
       </w:pPr>
       <w:r>
         <w:rPr>
           <w:rFonts w:hint="eastAsia"/>
+          <w:b/>
+          <w:bCs/>
         </w:rPr>
         <w:lastRenderedPageBreak/>
         <w:t>六、</w:t>
       </w:r>
       <w:r>
+        <w:rPr>
+          <w:rFonts w:hint="eastAsia"/>
+          <w:b/>
+          <w:bCs/>
+        </w:rPr>
+        <w:t>新增</w:t>
+      </w:r>
+      <w:r>
+        <w:rPr>
+          <w:b/>
+          <w:bCs/>
+        </w:rPr>
         <w:t>P</w:t>
       </w:r>
       <w:r>
         <w:rPr>
           <w:rFonts w:hint="eastAsia"/>
+          <w:b/>
+          <w:bCs/>
         </w:rPr>
         <w:t xml:space="preserve">iece-Piece (PP) </w:t>
       </w:r>
       <w:r>
         <w:rPr>
           <w:rFonts w:hint="eastAsia"/>
+          <w:b/>
+          <w:bCs/>
         </w:rPr>
         <w:t>特徵評估優化</w:t>
+      </w:r>
+    </w:p>
+    <w:p>
+      <w:r>
+        <w:rPr>
+          <w:rFonts w:hint="eastAsia"/>
+        </w:rPr>
+        <w:t>原有的</w:t>
+      </w:r>
+      <w:r>
+        <w:rPr>
+          <w:rFonts w:hint="eastAsia"/>
+        </w:rPr>
+        <w:t xml:space="preserve"> KP (King-Piece) </w:t>
+      </w:r>
+      <w:r>
+        <w:rPr>
+          <w:rFonts w:hint="eastAsia"/>
+        </w:rPr>
+        <w:t>評估函數僅考慮單一棋子所在的位置，缺乏「棋子協同作戰」的戰略觀念。這導致</w:t>
+      </w:r>
+      <w:r>
+        <w:rPr>
+          <w:rFonts w:hint="eastAsia"/>
+        </w:rPr>
+        <w:t xml:space="preserve"> AI </w:t>
+      </w:r>
+      <w:r>
+        <w:rPr>
+          <w:rFonts w:hint="eastAsia"/>
+        </w:rPr>
+        <w:t>不懂得保護兵形，也不懂得利用車</w:t>
+      </w:r>
+      <w:r>
+        <w:rPr>
+          <w:rFonts w:hint="eastAsia"/>
+        </w:rPr>
+        <w:t xml:space="preserve"> (Rook) </w:t>
+      </w:r>
+      <w:r>
+        <w:rPr>
+          <w:rFonts w:hint="eastAsia"/>
+        </w:rPr>
+        <w:t>搶佔開放線。新增</w:t>
+      </w:r>
+      <w:r>
+        <w:rPr>
+          <w:rFonts w:hint="eastAsia"/>
+        </w:rPr>
+        <w:t xml:space="preserve"> PP (Piece-Piece) </w:t>
+      </w:r>
+      <w:r>
+        <w:rPr>
+          <w:rFonts w:hint="eastAsia"/>
+        </w:rPr>
+        <w:t>特徵後，</w:t>
+      </w:r>
+      <w:r>
+        <w:rPr>
+          <w:rFonts w:hint="eastAsia"/>
+        </w:rPr>
+        <w:t xml:space="preserve">AI </w:t>
+      </w:r>
+      <w:r>
+        <w:rPr>
+          <w:rFonts w:hint="eastAsia"/>
+        </w:rPr>
+        <w:t>能夠辨識通路兵、相連兵與車的火線控制。</w:t>
+      </w:r>
+    </w:p>
+    <w:p>
+      <w:r>
+        <w:rPr>
+          <w:rFonts w:hint="eastAsia"/>
+        </w:rPr>
+        <w:t xml:space="preserve">1. </w:t>
+      </w:r>
+      <w:r>
+        <w:rPr>
+          <w:rFonts w:hint="eastAsia"/>
+        </w:rPr>
+        <w:t>定義</w:t>
+      </w:r>
+      <w:r>
+        <w:rPr>
+          <w:rFonts w:hint="eastAsia"/>
+        </w:rPr>
+        <w:t>PP</w:t>
+      </w:r>
+      <w:r>
+        <w:rPr>
+          <w:rFonts w:hint="eastAsia"/>
+        </w:rPr>
+        <w:t>常數加分，以及在</w:t>
+      </w:r>
+      <w:r>
+        <w:rPr>
+          <w:rFonts w:hint="eastAsia"/>
+        </w:rPr>
+        <w:t>evaluate</w:t>
+      </w:r>
+      <w:r>
+        <w:rPr>
+          <w:rFonts w:hint="eastAsia"/>
+        </w:rPr>
+        <w:t>函數中先預掃描變數</w:t>
+      </w:r>
+    </w:p>
+    <w:tbl>
+      <w:tblPr>
+        <w:tblStyle w:val="ae"/>
+        <w:tblW w:w="0" w:type="auto"/>
+        <w:tblLook w:val="04A0" w:firstRow="1" w:lastRow="0" w:firstColumn="1" w:lastColumn="0" w:noHBand="0" w:noVBand="1"/>
+      </w:tblPr>
+      <w:tblGrid>
+        <w:gridCol w:w="8296"/>
+      </w:tblGrid>
+      <w:tr>
+        <w:tc>
+          <w:tcPr>
+            <w:tcW w:w="8296" w:type="dxa"/>
+          </w:tcPr>
+          <w:p>
+            <w:pPr>
+              <w:rPr>
+                <w:rFonts w:ascii="Cascadia Code" w:hAnsi="Cascadia Code" w:cs="Cascadia Code"/>
+                <w:sz w:val="18"/>
+                <w:szCs w:val="22"/>
+              </w:rPr>
+            </w:pPr>
+            <w:r>
+              <w:rPr>
+                <w:rFonts w:ascii="Cascadia Code" w:hAnsi="Cascadia Code" w:cs="Cascadia Code"/>
+                <w:sz w:val="18"/>
+                <w:szCs w:val="22"/>
+              </w:rPr>
+              <w:t xml:space="preserve">const int BONUS_PASSED_PAWN = </w:t>
+            </w:r>
+            <w:r>
+              <w:rPr>
+                <w:rFonts w:ascii="Cascadia Code" w:hAnsi="Cascadia Code" w:cs="Cascadia Code" w:hint="eastAsia"/>
+                <w:sz w:val="18"/>
+                <w:szCs w:val="22"/>
+              </w:rPr>
+              <w:t>8</w:t>
+            </w:r>
+            <w:r>
+              <w:rPr>
+                <w:rFonts w:ascii="Cascadia Code" w:hAnsi="Cascadia Code" w:cs="Cascadia Code"/>
+                <w:sz w:val="18"/>
+                <w:szCs w:val="22"/>
+              </w:rPr>
+              <w:t xml:space="preserve">;           // </w:t>
+            </w:r>
+            <w:r>
+              <w:rPr>
+                <w:rFonts w:ascii="Cascadia Code" w:hAnsi="Cascadia Code" w:cs="Cascadia Code"/>
+                <w:sz w:val="18"/>
+                <w:szCs w:val="22"/>
+              </w:rPr>
+              <w:t>通路兵基礎加分</w:t>
+            </w:r>
+          </w:p>
+          <w:p>
+            <w:pPr>
+              <w:rPr>
+                <w:rFonts w:ascii="Cascadia Code" w:hAnsi="Cascadia Code" w:cs="Cascadia Code"/>
+                <w:sz w:val="18"/>
+                <w:szCs w:val="22"/>
+              </w:rPr>
+            </w:pPr>
+            <w:r>
+              <w:rPr>
+                <w:rFonts w:ascii="Cascadia Code" w:hAnsi="Cascadia Code" w:cs="Cascadia Code"/>
+                <w:sz w:val="18"/>
+                <w:szCs w:val="22"/>
+              </w:rPr>
+              <w:t xml:space="preserve">const int BONUS_PASSED_PAWN_STEP = 2;      // </w:t>
+            </w:r>
+            <w:r>
+              <w:rPr>
+                <w:rFonts w:ascii="Cascadia Code" w:hAnsi="Cascadia Code" w:cs="Cascadia Code"/>
+                <w:sz w:val="18"/>
+                <w:szCs w:val="22"/>
+              </w:rPr>
+              <w:t>通路兵推進加分</w:t>
+            </w:r>
+          </w:p>
+          <w:p>
+            <w:pPr>
+              <w:rPr>
+                <w:rFonts w:ascii="Cascadia Code" w:hAnsi="Cascadia Code" w:cs="Cascadia Code"/>
+                <w:sz w:val="18"/>
+                <w:szCs w:val="22"/>
+              </w:rPr>
+            </w:pPr>
+            <w:r>
+              <w:rPr>
+                <w:rFonts w:ascii="Cascadia Code" w:hAnsi="Cascadia Code" w:cs="Cascadia Code"/>
+                <w:sz w:val="18"/>
+                <w:szCs w:val="22"/>
+              </w:rPr>
+              <w:t xml:space="preserve">const int BONUS_CONNECTED_PASSED = </w:t>
+            </w:r>
+            <w:r>
+              <w:rPr>
+                <w:rFonts w:ascii="Cascadia Code" w:hAnsi="Cascadia Code" w:cs="Cascadia Code" w:hint="eastAsia"/>
+                <w:sz w:val="18"/>
+                <w:szCs w:val="22"/>
+              </w:rPr>
+              <w:t>10</w:t>
+            </w:r>
+            <w:r>
+              <w:rPr>
+                <w:rFonts w:ascii="Cascadia Code" w:hAnsi="Cascadia Code" w:cs="Cascadia Code"/>
+                <w:sz w:val="18"/>
+                <w:szCs w:val="22"/>
+              </w:rPr>
+              <w:t xml:space="preserve">;      // </w:t>
+            </w:r>
+            <w:r>
+              <w:rPr>
+                <w:rFonts w:ascii="Cascadia Code" w:hAnsi="Cascadia Code" w:cs="Cascadia Code"/>
+                <w:sz w:val="18"/>
+                <w:szCs w:val="22"/>
+              </w:rPr>
+              <w:t>相連通路兵</w:t>
+            </w:r>
+          </w:p>
+          <w:p>
+            <w:pPr>
+              <w:rPr>
+                <w:rFonts w:ascii="Cascadia Code" w:hAnsi="Cascadia Code" w:cs="Cascadia Code"/>
+                <w:sz w:val="18"/>
+                <w:szCs w:val="22"/>
+              </w:rPr>
+            </w:pPr>
+            <w:r>
+              <w:rPr>
+                <w:rFonts w:ascii="Cascadia Code" w:hAnsi="Cascadia Code" w:cs="Cascadia Code"/>
+                <w:sz w:val="18"/>
+                <w:szCs w:val="22"/>
+              </w:rPr>
+              <w:t xml:space="preserve">const int BONUS_ROOK_SEMI_OPEN = 2;        // </w:t>
+            </w:r>
+            <w:r>
+              <w:rPr>
+                <w:rFonts w:ascii="Cascadia Code" w:hAnsi="Cascadia Code" w:cs="Cascadia Code"/>
+                <w:sz w:val="18"/>
+                <w:szCs w:val="22"/>
+              </w:rPr>
+              <w:t>車在半開線</w:t>
+            </w:r>
+          </w:p>
+          <w:p>
+            <w:pPr>
+              <w:rPr>
+                <w:rFonts w:ascii="Cascadia Code" w:hAnsi="Cascadia Code" w:cs="Cascadia Code"/>
+                <w:sz w:val="18"/>
+                <w:szCs w:val="22"/>
+              </w:rPr>
+            </w:pPr>
+            <w:r>
+              <w:rPr>
+                <w:rFonts w:ascii="Cascadia Code" w:hAnsi="Cascadia Code" w:cs="Cascadia Code"/>
+                <w:sz w:val="18"/>
+                <w:szCs w:val="22"/>
+              </w:rPr>
+              <w:t xml:space="preserve">const int BONUS_ROOK_OPEN = 3;             // </w:t>
+            </w:r>
+            <w:r>
+              <w:rPr>
+                <w:rFonts w:ascii="Cascadia Code" w:hAnsi="Cascadia Code" w:cs="Cascadia Code"/>
+                <w:sz w:val="18"/>
+                <w:szCs w:val="22"/>
+              </w:rPr>
+              <w:t>車在全開線</w:t>
+            </w:r>
+          </w:p>
+          <w:p>
+            <w:pPr>
+              <w:rPr>
+                <w:rFonts w:ascii="Cascadia Code" w:hAnsi="Cascadia Code" w:cs="Cascadia Code"/>
+                <w:sz w:val="18"/>
+                <w:szCs w:val="22"/>
+              </w:rPr>
+            </w:pPr>
+            <w:r>
+              <w:rPr>
+                <w:rFonts w:ascii="Cascadia Code" w:hAnsi="Cascadia Code" w:cs="Cascadia Code"/>
+                <w:sz w:val="18"/>
+                <w:szCs w:val="22"/>
+              </w:rPr>
+              <w:t xml:space="preserve">const int BONUS_ROOK_7TH = 3;              // </w:t>
+            </w:r>
+            <w:r>
+              <w:rPr>
+                <w:rFonts w:ascii="Cascadia Code" w:hAnsi="Cascadia Code" w:cs="Cascadia Code"/>
+                <w:sz w:val="18"/>
+                <w:szCs w:val="22"/>
+              </w:rPr>
+              <w:t>車侵入後排</w:t>
+            </w:r>
+          </w:p>
+          <w:p>
+            <w:pPr>
+              <w:rPr>
+                <w:rFonts w:ascii="Cascadia Code" w:hAnsi="Cascadia Code" w:cs="Cascadia Code"/>
+                <w:sz w:val="18"/>
+                <w:szCs w:val="22"/>
+              </w:rPr>
+            </w:pPr>
+          </w:p>
+          <w:p>
+            <w:pPr>
+              <w:rPr>
+                <w:rFonts w:ascii="Cascadia Code" w:hAnsi="Cascadia Code" w:cs="Cascadia Code"/>
+                <w:sz w:val="18"/>
+                <w:szCs w:val="22"/>
+              </w:rPr>
+            </w:pPr>
+            <w:r>
+              <w:rPr>
+                <w:rFonts w:ascii="Cascadia Code" w:hAnsi="Cascadia Code" w:cs="Cascadia Code"/>
+                <w:sz w:val="18"/>
+                <w:szCs w:val="22"/>
+              </w:rPr>
+              <w:t>bool self_pawn_on_file[BOARD_W] = {false};</w:t>
+            </w:r>
+          </w:p>
+          <w:p>
+            <w:pPr>
+              <w:rPr>
+                <w:rFonts w:ascii="Cascadia Code" w:hAnsi="Cascadia Code" w:cs="Cascadia Code"/>
+                <w:sz w:val="18"/>
+                <w:szCs w:val="22"/>
+              </w:rPr>
+            </w:pPr>
+            <w:r>
+              <w:rPr>
+                <w:rFonts w:ascii="Cascadia Code" w:hAnsi="Cascadia Code" w:cs="Cascadia Code"/>
+                <w:sz w:val="18"/>
+                <w:szCs w:val="22"/>
+              </w:rPr>
+              <w:t>bool oppn_pawn_on_file[BOARD_W] = {false};</w:t>
+            </w:r>
+          </w:p>
+          <w:p>
+            <w:pPr>
+              <w:rPr>
+                <w:rFonts w:ascii="Cascadia Code" w:hAnsi="Cascadia Code" w:cs="Cascadia Code"/>
+                <w:sz w:val="18"/>
+                <w:szCs w:val="22"/>
+              </w:rPr>
+            </w:pPr>
+            <w:r>
+              <w:rPr>
+                <w:rFonts w:ascii="Cascadia Code" w:hAnsi="Cascadia Code" w:cs="Cascadia Code"/>
+                <w:sz w:val="18"/>
+                <w:szCs w:val="22"/>
+              </w:rPr>
+              <w:t>bool self_passed_on_file[BOARD_W] = {false};</w:t>
+            </w:r>
+          </w:p>
+          <w:p>
+            <w:pPr>
+              <w:rPr>
+                <w:rFonts w:ascii="Cascadia Code" w:hAnsi="Cascadia Code" w:cs="Cascadia Code"/>
+                <w:sz w:val="18"/>
+                <w:szCs w:val="22"/>
+              </w:rPr>
+            </w:pPr>
+            <w:r>
+              <w:rPr>
+                <w:rFonts w:ascii="Cascadia Code" w:hAnsi="Cascadia Code" w:cs="Cascadia Code"/>
+                <w:sz w:val="18"/>
+                <w:szCs w:val="22"/>
+              </w:rPr>
+              <w:t>bool oppn_passed_on_file[BOARD_W] = {false};</w:t>
+            </w:r>
+          </w:p>
+          <w:p>
+            <w:pPr>
+              <w:rPr>
+                <w:rFonts w:ascii="Cascadia Code" w:hAnsi="Cascadia Code" w:cs="Cascadia Code"/>
+                <w:sz w:val="18"/>
+                <w:szCs w:val="22"/>
+              </w:rPr>
+            </w:pPr>
+          </w:p>
+          <w:p>
+            <w:pPr>
+              <w:rPr>
+                <w:rFonts w:ascii="Cascadia Code" w:hAnsi="Cascadia Code" w:cs="Cascadia Code"/>
+                <w:sz w:val="18"/>
+                <w:szCs w:val="22"/>
+              </w:rPr>
+            </w:pPr>
+            <w:r>
+              <w:rPr>
+                <w:rFonts w:ascii="Cascadia Code" w:hAnsi="Cascadia Code" w:cs="Cascadia Code"/>
+                <w:sz w:val="18"/>
+                <w:szCs w:val="22"/>
+              </w:rPr>
+              <w:t xml:space="preserve">// </w:t>
+            </w:r>
+            <w:r>
+              <w:rPr>
+                <w:rFonts w:ascii="Cascadia Code" w:hAnsi="Cascadia Code" w:cs="Cascadia Code"/>
+                <w:sz w:val="18"/>
+                <w:szCs w:val="22"/>
+              </w:rPr>
+              <w:t>預掃描直線上是否有兵</w:t>
+            </w:r>
+          </w:p>
+          <w:p>
+            <w:pPr>
+              <w:rPr>
+                <w:rFonts w:ascii="Cascadia Code" w:hAnsi="Cascadia Code" w:cs="Cascadia Code"/>
+                <w:sz w:val="18"/>
+                <w:szCs w:val="22"/>
+              </w:rPr>
+            </w:pPr>
+            <w:r>
+              <w:rPr>
+                <w:rFonts w:ascii="Cascadia Code" w:hAnsi="Cascadia Code" w:cs="Cascadia Code"/>
+                <w:sz w:val="18"/>
+                <w:szCs w:val="22"/>
+              </w:rPr>
+              <w:t>for(int i = 0; i &lt; BOARD_H; ++i){</w:t>
+            </w:r>
+          </w:p>
+          <w:p>
+            <w:pPr>
+              <w:rPr>
+                <w:rFonts w:ascii="Cascadia Code" w:hAnsi="Cascadia Code" w:cs="Cascadia Code"/>
+                <w:sz w:val="18"/>
+                <w:szCs w:val="22"/>
+              </w:rPr>
+            </w:pPr>
+            <w:r>
+              <w:rPr>
+                <w:rFonts w:ascii="Cascadia Code" w:hAnsi="Cascadia Code" w:cs="Cascadia Code"/>
+                <w:sz w:val="18"/>
+                <w:szCs w:val="22"/>
+              </w:rPr>
+              <w:t xml:space="preserve">    for(int j = 0; j &lt; BOARD_W; ++j){</w:t>
+            </w:r>
+          </w:p>
+          <w:p>
+            <w:pPr>
+              <w:rPr>
+                <w:rFonts w:ascii="Cascadia Code" w:hAnsi="Cascadia Code" w:cs="Cascadia Code"/>
+                <w:sz w:val="18"/>
+                <w:szCs w:val="22"/>
+              </w:rPr>
+            </w:pPr>
+            <w:r>
+              <w:rPr>
+                <w:rFonts w:ascii="Cascadia Code" w:hAnsi="Cascadia Code" w:cs="Cascadia Code"/>
+                <w:sz w:val="18"/>
+                <w:szCs w:val="22"/>
+              </w:rPr>
+              <w:t xml:space="preserve">        if(self_board[i][j] == 1) self_pawn_on_file[j] = true;</w:t>
+            </w:r>
+          </w:p>
+          <w:p>
+            <w:pPr>
+              <w:rPr>
+                <w:rFonts w:ascii="Cascadia Code" w:hAnsi="Cascadia Code" w:cs="Cascadia Code"/>
+                <w:sz w:val="18"/>
+                <w:szCs w:val="22"/>
+              </w:rPr>
+            </w:pPr>
+            <w:r>
+              <w:rPr>
+                <w:rFonts w:ascii="Cascadia Code" w:hAnsi="Cascadia Code" w:cs="Cascadia Code"/>
+                <w:sz w:val="18"/>
+                <w:szCs w:val="22"/>
+              </w:rPr>
+              <w:t xml:space="preserve">        if(oppn_board[i][j] == 1) oppn_pawn_on_file[j] = true;</w:t>
+            </w:r>
+          </w:p>
+          <w:p>
+            <w:pPr>
+              <w:rPr>
+                <w:rFonts w:ascii="Cascadia Code" w:hAnsi="Cascadia Code" w:cs="Cascadia Code"/>
+                <w:sz w:val="18"/>
+                <w:szCs w:val="22"/>
+              </w:rPr>
+            </w:pPr>
+            <w:r>
+              <w:rPr>
+                <w:rFonts w:ascii="Cascadia Code" w:hAnsi="Cascadia Code" w:cs="Cascadia Code"/>
+                <w:sz w:val="18"/>
+                <w:szCs w:val="22"/>
+              </w:rPr>
+              <w:t xml:space="preserve">    }</w:t>
+            </w:r>
+          </w:p>
+          <w:p>
+            <w:pPr>
+              <w:rPr>
+                <w:rFonts w:hint="eastAsia"/>
+              </w:rPr>
+            </w:pPr>
+            <w:r>
+              <w:rPr>
+                <w:rFonts w:ascii="Cascadia Code" w:hAnsi="Cascadia Code" w:cs="Cascadia Code"/>
+                <w:sz w:val="18"/>
+                <w:szCs w:val="22"/>
+              </w:rPr>
+              <w:t>}</w:t>
+            </w:r>
+          </w:p>
+        </w:tc>
+      </w:tr>
+    </w:tbl>
+    <w:p/>
+    <w:p>
+      <w:pPr>
+        <w:rPr>
+          <w:rFonts w:hint="eastAsia"/>
+        </w:rPr>
+      </w:pPr>
+      <w:r>
+        <w:rPr>
+          <w:rFonts w:hint="eastAsia"/>
+        </w:rPr>
+        <w:t xml:space="preserve">2. </w:t>
+      </w:r>
+      <w:r>
+        <w:rPr>
+          <w:rFonts w:hint="eastAsia"/>
+        </w:rPr>
+        <w:t>在</w:t>
+      </w:r>
+      <w:r>
+        <w:rPr>
+          <w:rFonts w:hint="eastAsia"/>
+        </w:rPr>
+        <w:t>evaluate</w:t>
+      </w:r>
+      <w:r>
+        <w:rPr>
+          <w:rFonts w:hint="eastAsia"/>
+        </w:rPr>
+        <w:t>函數的雙層迴圈內新增通路兵和車的額外加分</w:t>
+      </w:r>
+    </w:p>
+    <w:tbl>
+      <w:tblPr>
+        <w:tblStyle w:val="ae"/>
+        <w:tblW w:w="0" w:type="auto"/>
+        <w:tblLook w:val="04A0" w:firstRow="1" w:lastRow="0" w:firstColumn="1" w:lastColumn="0" w:noHBand="0" w:noVBand="1"/>
+      </w:tblPr>
+      <w:tblGrid>
+        <w:gridCol w:w="8296"/>
+      </w:tblGrid>
+      <w:tr>
+        <w:tc>
+          <w:tcPr>
+            <w:tcW w:w="8296" w:type="dxa"/>
+          </w:tcPr>
+          <w:p>
+            <w:pPr>
+              <w:rPr>
+                <w:rFonts w:ascii="Cascadia Code" w:hAnsi="Cascadia Code" w:cs="Cascadia Code"/>
+                <w:sz w:val="18"/>
+                <w:szCs w:val="22"/>
+              </w:rPr>
+            </w:pPr>
+            <w:r>
+              <w:rPr>
+                <w:rFonts w:ascii="Cascadia Code" w:hAnsi="Cascadia Code" w:cs="Cascadia Code"/>
+                <w:sz w:val="18"/>
+                <w:szCs w:val="22"/>
+              </w:rPr>
+              <w:t xml:space="preserve">// </w:t>
+            </w:r>
+            <w:r>
+              <w:rPr>
+                <w:rFonts w:ascii="Cascadia Code" w:hAnsi="Cascadia Code" w:cs="Cascadia Code"/>
+                <w:sz w:val="18"/>
+                <w:szCs w:val="22"/>
+              </w:rPr>
+              <w:t>在</w:t>
+            </w:r>
+            <w:r>
+              <w:rPr>
+                <w:rFonts w:ascii="Cascadia Code" w:hAnsi="Cascadia Code" w:cs="Cascadia Code"/>
+                <w:sz w:val="18"/>
+                <w:szCs w:val="22"/>
+              </w:rPr>
+              <w:t xml:space="preserve"> evaluate </w:t>
+            </w:r>
+            <w:r>
+              <w:rPr>
+                <w:rFonts w:ascii="Cascadia Code" w:hAnsi="Cascadia Code" w:cs="Cascadia Code"/>
+                <w:sz w:val="18"/>
+                <w:szCs w:val="22"/>
+              </w:rPr>
+              <w:t>的我方棋子</w:t>
+            </w:r>
+            <w:r>
+              <w:rPr>
+                <w:rFonts w:ascii="Cascadia Code" w:hAnsi="Cascadia Code" w:cs="Cascadia Code"/>
+                <w:sz w:val="18"/>
+                <w:szCs w:val="22"/>
+              </w:rPr>
+              <w:t xml:space="preserve"> (self_piece) </w:t>
+            </w:r>
+            <w:r>
+              <w:rPr>
+                <w:rFonts w:ascii="Cascadia Code" w:hAnsi="Cascadia Code" w:cs="Cascadia Code"/>
+                <w:sz w:val="18"/>
+                <w:szCs w:val="22"/>
+              </w:rPr>
+              <w:t>邏輯內加入：</w:t>
+            </w:r>
+          </w:p>
+          <w:p>
+            <w:pPr>
+              <w:rPr>
+                <w:rFonts w:ascii="Cascadia Code" w:hAnsi="Cascadia Code" w:cs="Cascadia Code"/>
+                <w:sz w:val="18"/>
+                <w:szCs w:val="22"/>
+              </w:rPr>
+            </w:pPr>
+            <w:r>
+              <w:rPr>
+                <w:rFonts w:ascii="Cascadia Code" w:hAnsi="Cascadia Code" w:cs="Cascadia Code"/>
+                <w:sz w:val="18"/>
+                <w:szCs w:val="22"/>
+              </w:rPr>
+              <w:t xml:space="preserve">if(self_piece == 1) { // </w:t>
+            </w:r>
+            <w:r>
+              <w:rPr>
+                <w:rFonts w:ascii="Cascadia Code" w:hAnsi="Cascadia Code" w:cs="Cascadia Code"/>
+                <w:sz w:val="18"/>
+                <w:szCs w:val="22"/>
+              </w:rPr>
+              <w:t>兵</w:t>
+            </w:r>
+          </w:p>
+          <w:p>
+            <w:pPr>
+              <w:rPr>
+                <w:rFonts w:ascii="Cascadia Code" w:hAnsi="Cascadia Code" w:cs="Cascadia Code"/>
+                <w:sz w:val="18"/>
+                <w:szCs w:val="22"/>
+              </w:rPr>
+            </w:pPr>
+            <w:r>
+              <w:rPr>
+                <w:rFonts w:ascii="Cascadia Code" w:hAnsi="Cascadia Code" w:cs="Cascadia Code"/>
+                <w:sz w:val="18"/>
+                <w:szCs w:val="22"/>
+              </w:rPr>
+              <w:t xml:space="preserve">    bool passed = true;</w:t>
+            </w:r>
+          </w:p>
+          <w:p>
+            <w:pPr>
+              <w:rPr>
+                <w:rFonts w:ascii="Cascadia Code" w:hAnsi="Cascadia Code" w:cs="Cascadia Code"/>
+                <w:sz w:val="18"/>
+                <w:szCs w:val="22"/>
+              </w:rPr>
+            </w:pPr>
+            <w:r>
+              <w:rPr>
+                <w:rFonts w:ascii="Cascadia Code" w:hAnsi="Cascadia Code" w:cs="Cascadia Code"/>
+                <w:sz w:val="18"/>
+                <w:szCs w:val="22"/>
+              </w:rPr>
+              <w:t xml:space="preserve">    for(int cr = i + self_fwd; cr &gt;= 0 &amp;&amp; cr &lt; BOARD_H; cr += self_fwd){</w:t>
+            </w:r>
+          </w:p>
+          <w:p>
+            <w:pPr>
+              <w:rPr>
+                <w:rFonts w:ascii="Cascadia Code" w:hAnsi="Cascadia Code" w:cs="Cascadia Code"/>
+                <w:sz w:val="18"/>
+                <w:szCs w:val="22"/>
+              </w:rPr>
+            </w:pPr>
+            <w:r>
+              <w:rPr>
+                <w:rFonts w:ascii="Cascadia Code" w:hAnsi="Cascadia Code" w:cs="Cascadia Code"/>
+                <w:sz w:val="18"/>
+                <w:szCs w:val="22"/>
+              </w:rPr>
+              <w:t xml:space="preserve">        if(oppn_board[cr][j] == 1) { passed = false; break; }</w:t>
+            </w:r>
+          </w:p>
+          <w:p>
+            <w:pPr>
+              <w:rPr>
+                <w:rFonts w:ascii="Cascadia Code" w:hAnsi="Cascadia Code" w:cs="Cascadia Code"/>
+                <w:sz w:val="18"/>
+                <w:szCs w:val="22"/>
+              </w:rPr>
+            </w:pPr>
+            <w:r>
+              <w:rPr>
+                <w:rFonts w:ascii="Cascadia Code" w:hAnsi="Cascadia Code" w:cs="Cascadia Code"/>
+                <w:sz w:val="18"/>
+                <w:szCs w:val="22"/>
+              </w:rPr>
+              <w:t xml:space="preserve">        if(j &gt; 0 &amp;&amp; oppn_board[cr][j-1] == 1) { passed = false; break; }</w:t>
+            </w:r>
+          </w:p>
+          <w:p>
+            <w:pPr>
+              <w:rPr>
+                <w:rFonts w:ascii="Cascadia Code" w:hAnsi="Cascadia Code" w:cs="Cascadia Code"/>
+                <w:sz w:val="18"/>
+                <w:szCs w:val="22"/>
+              </w:rPr>
+            </w:pPr>
+            <w:r>
+              <w:rPr>
+                <w:rFonts w:ascii="Cascadia Code" w:hAnsi="Cascadia Code" w:cs="Cascadia Code"/>
+                <w:sz w:val="18"/>
+                <w:szCs w:val="22"/>
+              </w:rPr>
+              <w:t xml:space="preserve">        if(j &lt; BOARD_W - 1 &amp;&amp; oppn_board[cr][j+1] == 1) { passed = false; break; }</w:t>
+            </w:r>
+          </w:p>
+          <w:p>
+            <w:pPr>
+              <w:rPr>
+                <w:rFonts w:ascii="Cascadia Code" w:hAnsi="Cascadia Code" w:cs="Cascadia Code"/>
+                <w:sz w:val="18"/>
+                <w:szCs w:val="22"/>
+              </w:rPr>
+            </w:pPr>
+            <w:r>
+              <w:rPr>
+                <w:rFonts w:ascii="Cascadia Code" w:hAnsi="Cascadia Code" w:cs="Cascadia Code"/>
+                <w:sz w:val="18"/>
+                <w:szCs w:val="22"/>
+              </w:rPr>
+              <w:lastRenderedPageBreak/>
+              <w:t xml:space="preserve">    }</w:t>
+            </w:r>
+          </w:p>
+          <w:p>
+            <w:pPr>
+              <w:rPr>
+                <w:rFonts w:ascii="Cascadia Code" w:hAnsi="Cascadia Code" w:cs="Cascadia Code"/>
+                <w:sz w:val="18"/>
+                <w:szCs w:val="22"/>
+              </w:rPr>
+            </w:pPr>
+            <w:r>
+              <w:rPr>
+                <w:rFonts w:ascii="Cascadia Code" w:hAnsi="Cascadia Code" w:cs="Cascadia Code"/>
+                <w:sz w:val="18"/>
+                <w:szCs w:val="22"/>
+              </w:rPr>
+              <w:t xml:space="preserve">    if(passed) {</w:t>
+            </w:r>
+          </w:p>
+          <w:p>
+            <w:pPr>
+              <w:rPr>
+                <w:rFonts w:ascii="Cascadia Code" w:hAnsi="Cascadia Code" w:cs="Cascadia Code"/>
+                <w:sz w:val="18"/>
+                <w:szCs w:val="22"/>
+              </w:rPr>
+            </w:pPr>
+            <w:r>
+              <w:rPr>
+                <w:rFonts w:ascii="Cascadia Code" w:hAnsi="Cascadia Code" w:cs="Cascadia Code"/>
+                <w:sz w:val="18"/>
+                <w:szCs w:val="22"/>
+              </w:rPr>
+              <w:t xml:space="preserve">        self_passed_on_file[j] = true;</w:t>
+            </w:r>
+          </w:p>
+          <w:p>
+            <w:pPr>
+              <w:rPr>
+                <w:rFonts w:ascii="Cascadia Code" w:hAnsi="Cascadia Code" w:cs="Cascadia Code"/>
+                <w:sz w:val="18"/>
+                <w:szCs w:val="22"/>
+              </w:rPr>
+            </w:pPr>
+            <w:r>
+              <w:rPr>
+                <w:rFonts w:ascii="Cascadia Code" w:hAnsi="Cascadia Code" w:cs="Cascadia Code"/>
+                <w:sz w:val="18"/>
+                <w:szCs w:val="22"/>
+              </w:rPr>
+              <w:t xml:space="preserve">        int score = BONUS_PASSED_PAWN;</w:t>
+            </w:r>
+          </w:p>
+          <w:p>
+            <w:pPr>
+              <w:rPr>
+                <w:rFonts w:ascii="Cascadia Code" w:hAnsi="Cascadia Code" w:cs="Cascadia Code"/>
+                <w:sz w:val="18"/>
+                <w:szCs w:val="22"/>
+              </w:rPr>
+            </w:pPr>
+            <w:r>
+              <w:rPr>
+                <w:rFonts w:ascii="Cascadia Code" w:hAnsi="Cascadia Code" w:cs="Cascadia Code"/>
+                <w:sz w:val="18"/>
+                <w:szCs w:val="22"/>
+              </w:rPr>
+              <w:t xml:space="preserve">        </w:t>
+            </w:r>
+            <w:r>
+              <w:rPr>
+                <w:rFonts w:ascii="Cascadia Code" w:hAnsi="Cascadia Code" w:cs="Cascadia Code" w:hint="eastAsia"/>
+                <w:sz w:val="18"/>
+                <w:szCs w:val="22"/>
+              </w:rPr>
+              <w:t xml:space="preserve">int steps = i </w:t>
+            </w:r>
+            <w:r>
+              <w:rPr>
+                <w:rFonts w:ascii="Cascadia Code" w:hAnsi="Cascadia Code" w:cs="Cascadia Code"/>
+                <w:sz w:val="18"/>
+                <w:szCs w:val="22"/>
+              </w:rPr>
+              <w:t>–</w:t>
+            </w:r>
+            <w:r>
+              <w:rPr>
+                <w:rFonts w:ascii="Cascadia Code" w:hAnsi="Cascadia Code" w:cs="Cascadia Code" w:hint="eastAsia"/>
+                <w:sz w:val="18"/>
+                <w:szCs w:val="22"/>
+              </w:rPr>
+              <w:t xml:space="preserve"> 1;</w:t>
+            </w:r>
+          </w:p>
+          <w:p>
+            <w:pPr>
+              <w:rPr>
+                <w:rFonts w:ascii="Cascadia Code" w:hAnsi="Cascadia Code" w:cs="Cascadia Code" w:hint="eastAsia"/>
+                <w:sz w:val="18"/>
+                <w:szCs w:val="22"/>
+              </w:rPr>
+            </w:pPr>
+            <w:r>
+              <w:rPr>
+                <w:rFonts w:ascii="Cascadia Code" w:hAnsi="Cascadia Code" w:cs="Cascadia Code" w:hint="eastAsia"/>
+                <w:sz w:val="18"/>
+                <w:szCs w:val="22"/>
+              </w:rPr>
+              <w:t xml:space="preserve">        if (steps &gt; 0) score += </w:t>
+            </w:r>
+            <w:r>
+              <w:rPr>
+                <w:rFonts w:ascii="Cascadia Code" w:hAnsi="Cascadia Code" w:cs="Cascadia Code"/>
+                <w:sz w:val="18"/>
+                <w:szCs w:val="22"/>
+              </w:rPr>
+              <w:t>steps * BONUS_PASSED_PAWN_STEP;</w:t>
+            </w:r>
+          </w:p>
+          <w:p>
+            <w:pPr>
+              <w:rPr>
+                <w:rFonts w:ascii="Cascadia Code" w:hAnsi="Cascadia Code" w:cs="Cascadia Code"/>
+                <w:sz w:val="18"/>
+                <w:szCs w:val="22"/>
+              </w:rPr>
+            </w:pPr>
+            <w:r>
+              <w:rPr>
+                <w:rFonts w:ascii="Cascadia Code" w:hAnsi="Cascadia Code" w:cs="Cascadia Code"/>
+                <w:sz w:val="18"/>
+                <w:szCs w:val="22"/>
+              </w:rPr>
+              <w:t xml:space="preserve">        mg_score += score;</w:t>
+            </w:r>
+          </w:p>
+          <w:p>
+            <w:pPr>
+              <w:rPr>
+                <w:rFonts w:ascii="Cascadia Code" w:hAnsi="Cascadia Code" w:cs="Cascadia Code"/>
+                <w:sz w:val="18"/>
+                <w:szCs w:val="22"/>
+              </w:rPr>
+            </w:pPr>
+            <w:r>
+              <w:rPr>
+                <w:rFonts w:ascii="Cascadia Code" w:hAnsi="Cascadia Code" w:cs="Cascadia Code" w:hint="eastAsia"/>
+                <w:sz w:val="18"/>
+                <w:szCs w:val="22"/>
+              </w:rPr>
+              <w:t xml:space="preserve">        </w:t>
+            </w:r>
+            <w:r>
+              <w:rPr>
+                <w:rFonts w:ascii="Cascadia Code" w:hAnsi="Cascadia Code" w:cs="Cascadia Code"/>
+                <w:sz w:val="18"/>
+                <w:szCs w:val="22"/>
+              </w:rPr>
+              <w:t>eg_score += score;</w:t>
+            </w:r>
+          </w:p>
+          <w:p>
+            <w:pPr>
+              <w:rPr>
+                <w:rFonts w:ascii="Cascadia Code" w:hAnsi="Cascadia Code" w:cs="Cascadia Code"/>
+                <w:sz w:val="18"/>
+                <w:szCs w:val="22"/>
+              </w:rPr>
+            </w:pPr>
+            <w:r>
+              <w:rPr>
+                <w:rFonts w:ascii="Cascadia Code" w:hAnsi="Cascadia Code" w:cs="Cascadia Code"/>
+                <w:sz w:val="18"/>
+                <w:szCs w:val="22"/>
+              </w:rPr>
+              <w:t xml:space="preserve">    }</w:t>
+            </w:r>
+          </w:p>
+          <w:p>
+            <w:pPr>
+              <w:rPr>
+                <w:rFonts w:ascii="Cascadia Code" w:hAnsi="Cascadia Code" w:cs="Cascadia Code"/>
+                <w:sz w:val="18"/>
+                <w:szCs w:val="22"/>
+              </w:rPr>
+            </w:pPr>
+            <w:r>
+              <w:rPr>
+                <w:rFonts w:ascii="Cascadia Code" w:hAnsi="Cascadia Code" w:cs="Cascadia Code"/>
+                <w:sz w:val="18"/>
+                <w:szCs w:val="22"/>
+              </w:rPr>
+              <w:t xml:space="preserve">} else if(self_piece == 2) { // </w:t>
+            </w:r>
+            <w:r>
+              <w:rPr>
+                <w:rFonts w:ascii="Cascadia Code" w:hAnsi="Cascadia Code" w:cs="Cascadia Code"/>
+                <w:sz w:val="18"/>
+                <w:szCs w:val="22"/>
+              </w:rPr>
+              <w:t>車</w:t>
+            </w:r>
+          </w:p>
+          <w:p>
+            <w:pPr>
+              <w:rPr>
+                <w:rFonts w:ascii="Cascadia Code" w:hAnsi="Cascadia Code" w:cs="Cascadia Code"/>
+                <w:sz w:val="18"/>
+                <w:szCs w:val="22"/>
+              </w:rPr>
+            </w:pPr>
+            <w:r>
+              <w:rPr>
+                <w:rFonts w:ascii="Cascadia Code" w:hAnsi="Cascadia Code" w:cs="Cascadia Code"/>
+                <w:sz w:val="18"/>
+                <w:szCs w:val="22"/>
+              </w:rPr>
+              <w:t xml:space="preserve">    if(!self_pawn_on_file[j]) { </w:t>
+            </w:r>
+          </w:p>
+          <w:p>
+            <w:pPr>
+              <w:rPr>
+                <w:rFonts w:ascii="Cascadia Code" w:hAnsi="Cascadia Code" w:cs="Cascadia Code"/>
+                <w:sz w:val="18"/>
+                <w:szCs w:val="22"/>
+              </w:rPr>
+            </w:pPr>
+            <w:r>
+              <w:rPr>
+                <w:rFonts w:ascii="Cascadia Code" w:hAnsi="Cascadia Code" w:cs="Cascadia Code"/>
+                <w:sz w:val="18"/>
+                <w:szCs w:val="22"/>
+              </w:rPr>
+              <w:t xml:space="preserve">        if(!oppn_pawn_on_file[j]) {</w:t>
+            </w:r>
+          </w:p>
+          <w:p>
+            <w:pPr>
+              <w:ind w:firstLineChars="800" w:firstLine="1440"/>
+              <w:rPr>
+                <w:rFonts w:ascii="Cascadia Code" w:hAnsi="Cascadia Code" w:cs="Cascadia Code"/>
+                <w:sz w:val="18"/>
+                <w:szCs w:val="22"/>
+              </w:rPr>
+            </w:pPr>
+            <w:r>
+              <w:rPr>
+                <w:rFonts w:ascii="Cascadia Code" w:hAnsi="Cascadia Code" w:cs="Cascadia Code"/>
+                <w:sz w:val="18"/>
+                <w:szCs w:val="22"/>
+              </w:rPr>
+              <w:t>mg_score += BONUS_ROOK_OPEN;</w:t>
+            </w:r>
+          </w:p>
+          <w:p>
+            <w:pPr>
+              <w:ind w:firstLineChars="800" w:firstLine="1440"/>
+              <w:rPr>
+                <w:rFonts w:ascii="Cascadia Code" w:hAnsi="Cascadia Code" w:cs="Cascadia Code"/>
+                <w:sz w:val="18"/>
+                <w:szCs w:val="22"/>
+              </w:rPr>
+            </w:pPr>
+            <w:r>
+              <w:rPr>
+                <w:rFonts w:ascii="Cascadia Code" w:hAnsi="Cascadia Code" w:cs="Cascadia Code"/>
+                <w:sz w:val="18"/>
+                <w:szCs w:val="22"/>
+              </w:rPr>
+              <w:t>eg_score += BONUS_ROOK_OPEN;</w:t>
+            </w:r>
+          </w:p>
+          <w:p>
+            <w:pPr>
+              <w:ind w:firstLineChars="400" w:firstLine="720"/>
+              <w:rPr>
+                <w:rFonts w:ascii="Cascadia Code" w:hAnsi="Cascadia Code" w:cs="Cascadia Code"/>
+                <w:sz w:val="18"/>
+                <w:szCs w:val="22"/>
+              </w:rPr>
+            </w:pPr>
+            <w:r>
+              <w:rPr>
+                <w:rFonts w:ascii="Cascadia Code" w:hAnsi="Cascadia Code" w:cs="Cascadia Code"/>
+                <w:sz w:val="18"/>
+                <w:szCs w:val="22"/>
+              </w:rPr>
+              <w:t xml:space="preserve">} </w:t>
+            </w:r>
+          </w:p>
+          <w:p>
+            <w:pPr>
+              <w:rPr>
+                <w:rFonts w:ascii="Cascadia Code" w:hAnsi="Cascadia Code" w:cs="Cascadia Code"/>
+                <w:sz w:val="18"/>
+                <w:szCs w:val="22"/>
+              </w:rPr>
+            </w:pPr>
+            <w:r>
+              <w:rPr>
+                <w:rFonts w:ascii="Cascadia Code" w:hAnsi="Cascadia Code" w:cs="Cascadia Code"/>
+                <w:sz w:val="18"/>
+                <w:szCs w:val="22"/>
+              </w:rPr>
+              <w:t xml:space="preserve">        else { </w:t>
+            </w:r>
+          </w:p>
+          <w:p>
+            <w:pPr>
+              <w:ind w:firstLineChars="800" w:firstLine="1440"/>
+              <w:rPr>
+                <w:rFonts w:ascii="Cascadia Code" w:hAnsi="Cascadia Code" w:cs="Cascadia Code"/>
+                <w:sz w:val="18"/>
+                <w:szCs w:val="22"/>
+              </w:rPr>
+            </w:pPr>
+            <w:r>
+              <w:rPr>
+                <w:rFonts w:ascii="Cascadia Code" w:hAnsi="Cascadia Code" w:cs="Cascadia Code"/>
+                <w:sz w:val="18"/>
+                <w:szCs w:val="22"/>
+              </w:rPr>
+              <w:t>mg_score += BONUS_ROOK_SEMI_OPEN;</w:t>
+            </w:r>
+          </w:p>
+          <w:p>
+            <w:pPr>
+              <w:ind w:firstLineChars="800" w:firstLine="1440"/>
+              <w:rPr>
+                <w:rFonts w:ascii="Cascadia Code" w:hAnsi="Cascadia Code" w:cs="Cascadia Code"/>
+                <w:sz w:val="18"/>
+                <w:szCs w:val="22"/>
+              </w:rPr>
+            </w:pPr>
+            <w:r>
+              <w:rPr>
+                <w:rFonts w:ascii="Cascadia Code" w:hAnsi="Cascadia Code" w:cs="Cascadia Code"/>
+                <w:sz w:val="18"/>
+                <w:szCs w:val="22"/>
+              </w:rPr>
+              <w:t xml:space="preserve">eg_score += BONUS_ROOK_SEMI_OPEN; </w:t>
+            </w:r>
+          </w:p>
+          <w:p>
+            <w:pPr>
+              <w:ind w:firstLineChars="400" w:firstLine="720"/>
+              <w:rPr>
+                <w:rFonts w:ascii="Cascadia Code" w:hAnsi="Cascadia Code" w:cs="Cascadia Code"/>
+                <w:sz w:val="18"/>
+                <w:szCs w:val="22"/>
+              </w:rPr>
+            </w:pPr>
+            <w:r>
+              <w:rPr>
+                <w:rFonts w:ascii="Cascadia Code" w:hAnsi="Cascadia Code" w:cs="Cascadia Code"/>
+                <w:sz w:val="18"/>
+                <w:szCs w:val="22"/>
+              </w:rPr>
+              <w:t>}</w:t>
+            </w:r>
+          </w:p>
+          <w:p>
+            <w:pPr>
+              <w:rPr>
+                <w:rFonts w:ascii="Cascadia Code" w:hAnsi="Cascadia Code" w:cs="Cascadia Code"/>
+                <w:sz w:val="18"/>
+                <w:szCs w:val="22"/>
+              </w:rPr>
+            </w:pPr>
+            <w:r>
+              <w:rPr>
+                <w:rFonts w:ascii="Cascadia Code" w:hAnsi="Cascadia Code" w:cs="Cascadia Code"/>
+                <w:sz w:val="18"/>
+                <w:szCs w:val="22"/>
+              </w:rPr>
+              <w:t xml:space="preserve">    }</w:t>
+            </w:r>
+          </w:p>
+          <w:p>
+            <w:pPr>
+              <w:rPr>
+                <w:rFonts w:ascii="Cascadia Code" w:hAnsi="Cascadia Code" w:cs="Cascadia Code"/>
+                <w:sz w:val="18"/>
+                <w:szCs w:val="22"/>
+              </w:rPr>
+            </w:pPr>
+            <w:r>
+              <w:rPr>
+                <w:rFonts w:ascii="Cascadia Code" w:hAnsi="Cascadia Code" w:cs="Cascadia Code"/>
+                <w:sz w:val="18"/>
+                <w:szCs w:val="22"/>
+              </w:rPr>
+              <w:t xml:space="preserve">    </w:t>
+            </w:r>
+            <w:r>
+              <w:rPr>
+                <w:rFonts w:ascii="Cascadia Code" w:hAnsi="Cascadia Code" w:cs="Cascadia Code" w:hint="eastAsia"/>
+                <w:sz w:val="18"/>
+                <w:szCs w:val="22"/>
+              </w:rPr>
+              <w:t>if (i &gt;= BOARD_H -2){</w:t>
+            </w:r>
+          </w:p>
+          <w:p>
+            <w:pPr>
+              <w:rPr>
+                <w:rFonts w:ascii="Cascadia Code" w:hAnsi="Cascadia Code" w:cs="Cascadia Code"/>
+                <w:sz w:val="18"/>
+                <w:szCs w:val="22"/>
+              </w:rPr>
+            </w:pPr>
+            <w:r>
+              <w:rPr>
+                <w:rFonts w:ascii="Cascadia Code" w:hAnsi="Cascadia Code" w:cs="Cascadia Code" w:hint="eastAsia"/>
+                <w:sz w:val="18"/>
+                <w:szCs w:val="22"/>
+              </w:rPr>
+              <w:t xml:space="preserve">        </w:t>
+            </w:r>
+            <w:r>
+              <w:rPr>
+                <w:rFonts w:ascii="Cascadia Code" w:hAnsi="Cascadia Code" w:cs="Cascadia Code"/>
+                <w:sz w:val="18"/>
+                <w:szCs w:val="22"/>
+              </w:rPr>
+              <w:t>mg_score += BONUS_ROOK_7TH;</w:t>
+            </w:r>
+          </w:p>
+          <w:p>
+            <w:pPr>
+              <w:rPr>
+                <w:rFonts w:ascii="Cascadia Code" w:hAnsi="Cascadia Code" w:cs="Cascadia Code" w:hint="eastAsia"/>
+                <w:sz w:val="18"/>
+                <w:szCs w:val="22"/>
+              </w:rPr>
+            </w:pPr>
+            <w:r>
+              <w:rPr>
+                <w:rFonts w:ascii="Cascadia Code" w:hAnsi="Cascadia Code" w:cs="Cascadia Code"/>
+                <w:sz w:val="18"/>
+                <w:szCs w:val="22"/>
+              </w:rPr>
+              <w:t>       </w:t>
+            </w:r>
+            <w:r>
+              <w:rPr>
+                <w:rFonts w:ascii="Cascadia Code" w:hAnsi="Cascadia Code" w:cs="Cascadia Code" w:hint="eastAsia"/>
+                <w:sz w:val="18"/>
+                <w:szCs w:val="22"/>
+              </w:rPr>
+              <w:t xml:space="preserve"> </w:t>
+            </w:r>
+            <w:r>
+              <w:rPr>
+                <w:rFonts w:ascii="Cascadia Code" w:hAnsi="Cascadia Code" w:cs="Cascadia Code"/>
+                <w:sz w:val="18"/>
+                <w:szCs w:val="22"/>
+              </w:rPr>
+              <w:t>eg_score += BONUS_ROOK_7TH;</w:t>
+            </w:r>
+          </w:p>
+          <w:p>
+            <w:pPr>
+              <w:ind w:firstLineChars="200" w:firstLine="360"/>
+              <w:rPr>
+                <w:rFonts w:ascii="Cascadia Code" w:hAnsi="Cascadia Code" w:cs="Cascadia Code" w:hint="eastAsia"/>
+                <w:sz w:val="18"/>
+                <w:szCs w:val="22"/>
+              </w:rPr>
+            </w:pPr>
+            <w:r>
+              <w:rPr>
+                <w:rFonts w:ascii="Cascadia Code" w:hAnsi="Cascadia Code" w:cs="Cascadia Code" w:hint="eastAsia"/>
+                <w:sz w:val="18"/>
+                <w:szCs w:val="22"/>
+              </w:rPr>
+              <w:t>}</w:t>
+            </w:r>
+          </w:p>
+          <w:p>
+            <w:pPr>
+              <w:rPr>
+                <w:rFonts w:ascii="Cascadia Code" w:hAnsi="Cascadia Code" w:cs="Cascadia Code"/>
+                <w:sz w:val="18"/>
+                <w:szCs w:val="22"/>
+              </w:rPr>
+            </w:pPr>
+            <w:r>
+              <w:rPr>
+                <w:rFonts w:ascii="Cascadia Code" w:hAnsi="Cascadia Code" w:cs="Cascadia Code"/>
+                <w:sz w:val="18"/>
+                <w:szCs w:val="22"/>
+              </w:rPr>
+              <w:t>}</w:t>
+            </w:r>
+          </w:p>
+          <w:p>
+            <w:pPr>
+              <w:rPr>
+                <w:rFonts w:ascii="Cascadia Code" w:hAnsi="Cascadia Code" w:cs="Cascadia Code"/>
+                <w:sz w:val="18"/>
+                <w:szCs w:val="22"/>
+              </w:rPr>
+            </w:pPr>
+          </w:p>
+          <w:p>
+            <w:pPr>
+              <w:rPr>
+                <w:rFonts w:hint="eastAsia"/>
+              </w:rPr>
+            </w:pPr>
+            <w:r>
+              <w:rPr>
+                <w:rFonts w:ascii="Cascadia Code" w:hAnsi="Cascadia Code" w:cs="Cascadia Code"/>
+                <w:sz w:val="18"/>
+                <w:szCs w:val="22"/>
+              </w:rPr>
+              <w:t xml:space="preserve">// </w:t>
+            </w:r>
+            <w:r>
+              <w:rPr>
+                <w:rFonts w:ascii="Cascadia Code" w:hAnsi="Cascadia Code" w:cs="Cascadia Code"/>
+                <w:sz w:val="18"/>
+                <w:szCs w:val="22"/>
+              </w:rPr>
+              <w:t>註：在處理</w:t>
+            </w:r>
+            <w:r>
+              <w:rPr>
+                <w:rFonts w:ascii="Cascadia Code" w:hAnsi="Cascadia Code" w:cs="Cascadia Code"/>
+                <w:sz w:val="18"/>
+                <w:szCs w:val="22"/>
+              </w:rPr>
+              <w:t xml:space="preserve"> oppn_piece </w:t>
+            </w:r>
+            <w:r>
+              <w:rPr>
+                <w:rFonts w:ascii="Cascadia Code" w:hAnsi="Cascadia Code" w:cs="Cascadia Code"/>
+                <w:sz w:val="18"/>
+                <w:szCs w:val="22"/>
+              </w:rPr>
+              <w:t>時，使用</w:t>
+            </w:r>
+            <w:r>
+              <w:rPr>
+                <w:rFonts w:ascii="Cascadia Code" w:hAnsi="Cascadia Code" w:cs="Cascadia Code"/>
+                <w:sz w:val="18"/>
+                <w:szCs w:val="22"/>
+              </w:rPr>
+              <w:t xml:space="preserve"> oppn_fwd </w:t>
+            </w:r>
+            <w:r>
+              <w:rPr>
+                <w:rFonts w:ascii="Cascadia Code" w:hAnsi="Cascadia Code" w:cs="Cascadia Code"/>
+                <w:sz w:val="18"/>
+                <w:szCs w:val="22"/>
+              </w:rPr>
+              <w:t>進行相同邏輯掃描，並將分數以</w:t>
+            </w:r>
+            <w:r>
+              <w:rPr>
+                <w:rFonts w:ascii="Cascadia Code" w:hAnsi="Cascadia Code" w:cs="Cascadia Code"/>
+                <w:sz w:val="18"/>
+                <w:szCs w:val="22"/>
+              </w:rPr>
+              <w:t xml:space="preserve"> -= </w:t>
+            </w:r>
+            <w:r>
+              <w:rPr>
+                <w:rFonts w:ascii="Cascadia Code" w:hAnsi="Cascadia Code" w:cs="Cascadia Code"/>
+                <w:sz w:val="18"/>
+                <w:szCs w:val="22"/>
+              </w:rPr>
+              <w:t>扣除。</w:t>
+            </w:r>
+          </w:p>
+        </w:tc>
+      </w:tr>
+    </w:tbl>
+    <w:p/>
+    <w:p>
+      <w:r>
+        <w:rPr>
+          <w:rFonts w:hint="eastAsia"/>
+        </w:rPr>
+        <w:t xml:space="preserve">3. </w:t>
+      </w:r>
+      <w:r>
+        <w:rPr>
+          <w:rFonts w:hint="eastAsia"/>
+        </w:rPr>
+        <w:t>在</w:t>
+      </w:r>
+      <w:r>
+        <w:rPr>
+          <w:rFonts w:hint="eastAsia"/>
+        </w:rPr>
+        <w:t>evaluate</w:t>
+      </w:r>
+      <w:r>
+        <w:rPr>
+          <w:rFonts w:hint="eastAsia"/>
+        </w:rPr>
+        <w:t>函數內的雙層迴圈結束後，新增相連通路兵額外加分</w:t>
+      </w:r>
+    </w:p>
+    <w:tbl>
+      <w:tblPr>
+        <w:tblStyle w:val="ae"/>
+        <w:tblW w:w="0" w:type="auto"/>
+        <w:tblLook w:val="04A0" w:firstRow="1" w:lastRow="0" w:firstColumn="1" w:lastColumn="0" w:noHBand="0" w:noVBand="1"/>
+      </w:tblPr>
+      <w:tblGrid>
+        <w:gridCol w:w="8296"/>
+      </w:tblGrid>
+      <w:tr>
+        <w:tc>
+          <w:tcPr>
+            <w:tcW w:w="8296" w:type="dxa"/>
+          </w:tcPr>
+          <w:p>
+            <w:pPr>
+              <w:rPr>
+                <w:rFonts w:ascii="Cascadia Code" w:hAnsi="Cascadia Code" w:cs="Cascadia Code"/>
+                <w:sz w:val="18"/>
+                <w:szCs w:val="22"/>
+              </w:rPr>
+            </w:pPr>
+            <w:r>
+              <w:rPr>
+                <w:rFonts w:ascii="Cascadia Code" w:hAnsi="Cascadia Code" w:cs="Cascadia Code"/>
+                <w:sz w:val="18"/>
+                <w:szCs w:val="22"/>
+              </w:rPr>
+              <w:t>for(int j = 0; j &lt; BOARD_W - 1; ++j){</w:t>
+            </w:r>
+          </w:p>
+          <w:p>
+            <w:pPr>
+              <w:rPr>
+                <w:rFonts w:ascii="Cascadia Code" w:hAnsi="Cascadia Code" w:cs="Cascadia Code"/>
+                <w:sz w:val="18"/>
+                <w:szCs w:val="22"/>
+              </w:rPr>
+            </w:pPr>
+            <w:r>
+              <w:rPr>
+                <w:rFonts w:ascii="Cascadia Code" w:hAnsi="Cascadia Code" w:cs="Cascadia Code"/>
+                <w:sz w:val="18"/>
+                <w:szCs w:val="22"/>
+              </w:rPr>
+              <w:t xml:space="preserve">    if(self_passed_on_file[j] &amp;&amp; self_passed_on_file[j+1]) {</w:t>
+            </w:r>
+          </w:p>
+          <w:p>
+            <w:pPr>
+              <w:rPr>
+                <w:rFonts w:ascii="Cascadia Code" w:hAnsi="Cascadia Code" w:cs="Cascadia Code"/>
+                <w:sz w:val="18"/>
+                <w:szCs w:val="22"/>
+              </w:rPr>
+            </w:pPr>
+            <w:r>
+              <w:rPr>
+                <w:rFonts w:ascii="Cascadia Code" w:hAnsi="Cascadia Code" w:cs="Cascadia Code"/>
+                <w:sz w:val="18"/>
+                <w:szCs w:val="22"/>
+              </w:rPr>
+              <w:t xml:space="preserve">        mg_score += BONUS_CONNECTED_PASSED;</w:t>
+            </w:r>
+          </w:p>
+          <w:p>
+            <w:pPr>
+              <w:rPr>
+                <w:rFonts w:ascii="Cascadia Code" w:hAnsi="Cascadia Code" w:cs="Cascadia Code"/>
+                <w:sz w:val="18"/>
+                <w:szCs w:val="22"/>
+              </w:rPr>
+            </w:pPr>
+            <w:r>
+              <w:rPr>
+                <w:rFonts w:ascii="Cascadia Code" w:hAnsi="Cascadia Code" w:cs="Cascadia Code"/>
+                <w:sz w:val="18"/>
+                <w:szCs w:val="22"/>
+              </w:rPr>
+              <w:t xml:space="preserve">        eg_score += BONUS_CONNECTED_PASSED;</w:t>
+            </w:r>
+          </w:p>
+          <w:p>
+            <w:pPr>
+              <w:rPr>
+                <w:rFonts w:ascii="Cascadia Code" w:hAnsi="Cascadia Code" w:cs="Cascadia Code"/>
+                <w:sz w:val="18"/>
+                <w:szCs w:val="22"/>
+              </w:rPr>
+            </w:pPr>
+            <w:r>
+              <w:rPr>
+                <w:rFonts w:ascii="Cascadia Code" w:hAnsi="Cascadia Code" w:cs="Cascadia Code"/>
+                <w:sz w:val="18"/>
+                <w:szCs w:val="22"/>
+              </w:rPr>
+              <w:t xml:space="preserve">    }</w:t>
+            </w:r>
+          </w:p>
+          <w:p>
+            <w:pPr>
+              <w:rPr>
+                <w:rFonts w:ascii="Cascadia Code" w:hAnsi="Cascadia Code" w:cs="Cascadia Code"/>
+                <w:sz w:val="18"/>
+                <w:szCs w:val="22"/>
+              </w:rPr>
+            </w:pPr>
+            <w:r>
+              <w:rPr>
+                <w:rFonts w:ascii="Cascadia Code" w:hAnsi="Cascadia Code" w:cs="Cascadia Code"/>
+                <w:sz w:val="18"/>
+                <w:szCs w:val="22"/>
+              </w:rPr>
+              <w:t xml:space="preserve">    if(oppn_passed_on_file[j] &amp;&amp; oppn_passed_on_file[j+1]) {</w:t>
+            </w:r>
+          </w:p>
+          <w:p>
+            <w:pPr>
+              <w:rPr>
+                <w:rFonts w:ascii="Cascadia Code" w:hAnsi="Cascadia Code" w:cs="Cascadia Code"/>
+                <w:sz w:val="18"/>
+                <w:szCs w:val="22"/>
+              </w:rPr>
+            </w:pPr>
+            <w:r>
+              <w:rPr>
+                <w:rFonts w:ascii="Cascadia Code" w:hAnsi="Cascadia Code" w:cs="Cascadia Code"/>
+                <w:sz w:val="18"/>
+                <w:szCs w:val="22"/>
+              </w:rPr>
+              <w:t xml:space="preserve">        mg_score -= BONUS_CONNECTED_PASSED;</w:t>
+            </w:r>
+          </w:p>
+          <w:p>
+            <w:pPr>
+              <w:rPr>
+                <w:rFonts w:ascii="Cascadia Code" w:hAnsi="Cascadia Code" w:cs="Cascadia Code"/>
+                <w:sz w:val="18"/>
+                <w:szCs w:val="22"/>
+              </w:rPr>
+            </w:pPr>
+            <w:r>
+              <w:rPr>
+                <w:rFonts w:ascii="Cascadia Code" w:hAnsi="Cascadia Code" w:cs="Cascadia Code"/>
+                <w:sz w:val="18"/>
+                <w:szCs w:val="22"/>
+              </w:rPr>
+              <w:t xml:space="preserve">        eg_score -= BONUS_CONNECTED_PASSED;</w:t>
+            </w:r>
+          </w:p>
+          <w:p>
+            <w:pPr>
+              <w:rPr>
+                <w:rFonts w:ascii="Cascadia Code" w:hAnsi="Cascadia Code" w:cs="Cascadia Code"/>
+                <w:sz w:val="18"/>
+                <w:szCs w:val="22"/>
+              </w:rPr>
+            </w:pPr>
+            <w:r>
+              <w:rPr>
+                <w:rFonts w:ascii="Cascadia Code" w:hAnsi="Cascadia Code" w:cs="Cascadia Code"/>
+                <w:sz w:val="18"/>
+                <w:szCs w:val="22"/>
+              </w:rPr>
+              <w:lastRenderedPageBreak/>
+              <w:t xml:space="preserve">    }</w:t>
+            </w:r>
+          </w:p>
+          <w:p>
+            <w:pPr>
+              <w:rPr>
+                <w:rFonts w:hint="eastAsia"/>
+              </w:rPr>
+            </w:pPr>
+            <w:r>
+              <w:rPr>
+                <w:rFonts w:ascii="Cascadia Code" w:hAnsi="Cascadia Code" w:cs="Cascadia Code"/>
+                <w:sz w:val="18"/>
+                <w:szCs w:val="22"/>
+              </w:rPr>
+              <w:t>}</w:t>
+            </w:r>
+          </w:p>
+        </w:tc>
+      </w:tr>
+    </w:tbl>
+    <w:p/>
+    <w:p>
+      <w:r>
+        <w:t>考量到</w:t>
+      </w:r>
+      <w:r>
+        <w:t xml:space="preserve"> 5×6 Minichess </w:t>
+      </w:r>
+      <w:r>
+        <w:t>棋盤較小、升變速度快，</w:t>
+      </w:r>
+      <w:r>
+        <w:rPr>
+          <w:rFonts w:hint="eastAsia"/>
+        </w:rPr>
+        <w:t>我選擇</w:t>
+      </w:r>
+      <w:r>
+        <w:t>額外加入通路兵、深入通路兵、相連通路兵、車在半開線與全開線，以及車深入敵方後兩排等特徵。這些特徵能有效反映通路兵的升變威脅與車的長程火力優勢，補足單純位置分數無法表達的戰略價值，同時具有計算成本低、對搜尋深度影響小的優點。</w:t>
+      </w:r>
+    </w:p>
+    <w:p>
+      <w:pPr>
+        <w:widowControl/>
+      </w:pPr>
+      <w:r>
+        <w:br w:type="page"/>
+      </w:r>
+    </w:p>
+    <w:p>
+      <w:r>
+        <w:rPr>
+          <w:rFonts w:hint="eastAsia"/>
+        </w:rPr>
+        <w:lastRenderedPageBreak/>
+        <w:t>七、迭代加深</w:t>
+      </w:r>
+      <w:r>
+        <w:rPr>
+          <w:rFonts w:hint="eastAsia"/>
+        </w:rPr>
+        <w:t xml:space="preserve"> </w:t>
+      </w:r>
+      <w:r>
+        <w:t>(</w:t>
+      </w:r>
+      <w:r>
+        <w:rPr>
+          <w:rFonts w:hint="eastAsia"/>
+        </w:rPr>
+        <w:t xml:space="preserve">Iterative Deepening) </w:t>
+      </w:r>
+      <w:r>
+        <w:rPr>
+          <w:rFonts w:hint="eastAsia"/>
+        </w:rPr>
+        <w:t>與時間防護機制</w:t>
+      </w:r>
+    </w:p>
+    <w:p>
+      <w:pPr>
+        <w:rPr>
+          <w:rFonts w:hint="eastAsia"/>
+        </w:rPr>
+      </w:pPr>
+      <w:r>
+        <w:rPr>
+          <w:rFonts w:hint="eastAsia"/>
+        </w:rPr>
+        <w:t>在</w:t>
+      </w:r>
+      <w:r>
+        <w:rPr>
+          <w:rFonts w:hint="eastAsia"/>
+        </w:rPr>
+        <w:t>CLI</w:t>
+      </w:r>
+      <w:r>
+        <w:rPr>
+          <w:rFonts w:hint="eastAsia"/>
+        </w:rPr>
+        <w:t>環境下，因為在時間限制結束以後，</w:t>
       </w:r>
     </w:p>
     <w:sectPr>

</xml_diff>